<commit_message>
update document in microservice
</commit_message>
<xml_diff>
--- a/Bo_Cau_Hoi_Theo_Chu_De_REWRITE_2025-10-11.docx
+++ b/Bo_Cau_Hoi_Theo_Chu_De_REWRITE_2025-10-11.docx
@@ -601,7 +601,687 @@
         <w:t xml:space="preserve">SettingServiceImpl, SettingRepository, SettingFilter, Setting, Currency, EmailSettingBag, CurrencySettingBag, PaymentSettingBag. </w:t>
       </w:r>
     </w:p>
+    <w:p>
+      <w:r>
+        <w:br/>
+      </w:r>
+      <w:r>
+        <w:t># ví dụ (giữ 1 partition là đủ dev)</w:t>
+      </w:r>
+    </w:p>
+    <w:p>
+      <w:r>
+        <w:t>kafka-topics.sh --create --topic eshop.cart.get.req --bootstrap-server localhost:9092 --partitions 1 --replication-factor 1</w:t>
+      </w:r>
+    </w:p>
+    <w:p>
+      <w:r>
+        <w:t>kafka-topics.sh --create --topic eshop.cart.get.resp --bootstrap-server localhost:9092 --partitions 1 --replication-factor 1</w:t>
+      </w:r>
+    </w:p>
+    <w:p>
+      <w:r>
+        <w:t>kafka-topics.sh --create --topic eshop.cart.clear.cmd --bootstrap-server localhost:9092 --partitions 1 --replication-factor 1</w:t>
+      </w:r>
+    </w:p>
     <w:p/>
+    <w:p>
+      <w:r>
+        <w:t>kafka-topics.sh --create --topic eshop.shipping.rate.req --bootstrap-server localhost:9092 --partitions 1 --replication-factor 1</w:t>
+      </w:r>
+    </w:p>
+    <w:p>
+      <w:r>
+        <w:t>kafka-topics.sh --create --topic eshop.shipping.rate.resp --bootstrap-server localhost:9092 --partitions 1 --replication-factor 1</w:t>
+      </w:r>
+    </w:p>
+    <w:p>
+      <w:pPr>
+        <w:rPr>
+          <w:lang w:val="en-GB"/>
+        </w:rPr>
+      </w:pPr>
+      <w:r>
+        <w:rPr>
+          <w:b/>
+          <w:bCs/>
+          <w:lang w:val="en-GB"/>
+        </w:rPr>
+        <w:lastRenderedPageBreak/>
+        <w:t>A. Request/Reply (hỏi – đáp đồng bộ qua Kafka)</w:t>
+      </w:r>
+    </w:p>
+    <w:p>
+      <w:pPr>
+        <w:numPr>
+          <w:ilvl w:val="0"/>
+          <w:numId w:val="21"/>
+        </w:numPr>
+        <w:rPr>
+          <w:lang w:val="en-GB"/>
+        </w:rPr>
+      </w:pPr>
+      <w:r>
+        <w:rPr>
+          <w:b/>
+          <w:bCs/>
+          <w:lang w:val="en-GB"/>
+        </w:rPr>
+        <w:t>Producer</w:t>
+      </w:r>
+      <w:r>
+        <w:rPr>
+          <w:lang w:val="en-GB"/>
+        </w:rPr>
+        <w:t xml:space="preserve"> (ví dụ checkout-service) gọi:</w:t>
+      </w:r>
+    </w:p>
+    <w:p>
+      <w:pPr>
+        <w:numPr>
+          <w:ilvl w:val="1"/>
+          <w:numId w:val="21"/>
+        </w:numPr>
+        <w:rPr>
+          <w:lang w:val="en-GB"/>
+        </w:rPr>
+      </w:pPr>
+      <w:r>
+        <w:rPr>
+          <w:lang w:val="en-GB"/>
+        </w:rPr>
+        <w:t>RequestReplyClient.request(topicReq, topicResp, ...).</w:t>
+      </w:r>
+    </w:p>
+    <w:p>
+      <w:pPr>
+        <w:numPr>
+          <w:ilvl w:val="1"/>
+          <w:numId w:val="21"/>
+        </w:numPr>
+        <w:rPr>
+          <w:lang w:val="en-GB"/>
+        </w:rPr>
+      </w:pPr>
+      <w:r>
+        <w:rPr>
+          <w:lang w:val="en-GB"/>
+        </w:rPr>
+        <w:t>Tạo correlationId + replyTo và kafkaTemplate.send(topicReq, payload).</w:t>
+      </w:r>
+    </w:p>
+    <w:p>
+      <w:pPr>
+        <w:numPr>
+          <w:ilvl w:val="0"/>
+          <w:numId w:val="21"/>
+        </w:numPr>
+        <w:rPr>
+          <w:lang w:val="en-GB"/>
+        </w:rPr>
+      </w:pPr>
+      <w:r>
+        <w:rPr>
+          <w:b/>
+          <w:bCs/>
+          <w:lang w:val="en-GB"/>
+        </w:rPr>
+        <w:t>Kafka broker</w:t>
+      </w:r>
+      <w:r>
+        <w:rPr>
+          <w:lang w:val="en-GB"/>
+        </w:rPr>
+        <w:t xml:space="preserve"> ghi message vào partition.</w:t>
+      </w:r>
+    </w:p>
+    <w:p>
+      <w:pPr>
+        <w:numPr>
+          <w:ilvl w:val="0"/>
+          <w:numId w:val="21"/>
+        </w:numPr>
+        <w:rPr>
+          <w:lang w:val="en-GB"/>
+        </w:rPr>
+      </w:pPr>
+      <w:r>
+        <w:rPr>
+          <w:b/>
+          <w:bCs/>
+          <w:lang w:val="en-GB"/>
+        </w:rPr>
+        <w:t>Consumer</w:t>
+      </w:r>
+      <w:r>
+        <w:rPr>
+          <w:lang w:val="en-GB"/>
+        </w:rPr>
+        <w:t xml:space="preserve"> (ví dụ cart-service) có @KafkaListener(topics=...) nhận message → </w:t>
+      </w:r>
+      <w:r>
+        <w:rPr>
+          <w:b/>
+          <w:bCs/>
+          <w:lang w:val="en-GB"/>
+        </w:rPr>
+        <w:t>gọi nghiệp vụ</w:t>
+      </w:r>
+      <w:r>
+        <w:rPr>
+          <w:lang w:val="en-GB"/>
+        </w:rPr>
+        <w:t>:</w:t>
+      </w:r>
+    </w:p>
+    <w:p>
+      <w:pPr>
+        <w:numPr>
+          <w:ilvl w:val="1"/>
+          <w:numId w:val="21"/>
+        </w:numPr>
+        <w:rPr>
+          <w:lang w:val="en-GB"/>
+        </w:rPr>
+      </w:pPr>
+      <w:r>
+        <w:rPr>
+          <w:lang w:val="en-GB"/>
+        </w:rPr>
+        <w:t>Lớp mỏng: CartMessageHandler.onGetCart(...).</w:t>
+      </w:r>
+    </w:p>
+    <w:p>
+      <w:pPr>
+        <w:numPr>
+          <w:ilvl w:val="1"/>
+          <w:numId w:val="21"/>
+        </w:numPr>
+        <w:rPr>
+          <w:lang w:val="en-GB"/>
+        </w:rPr>
+      </w:pPr>
+      <w:r>
+        <w:rPr>
+          <w:lang w:val="en-GB"/>
+        </w:rPr>
+        <w:t xml:space="preserve">Gọi sâu vào </w:t>
+      </w:r>
+      <w:r>
+        <w:rPr>
+          <w:b/>
+          <w:bCs/>
+          <w:lang w:val="en-GB"/>
+        </w:rPr>
+        <w:t>ShoppingCartServiceImpl</w:t>
+      </w:r>
+      <w:r>
+        <w:rPr>
+          <w:lang w:val="en-GB"/>
+        </w:rPr>
+        <w:t xml:space="preserve"> → </w:t>
+      </w:r>
+      <w:r>
+        <w:rPr>
+          <w:b/>
+          <w:bCs/>
+          <w:lang w:val="en-GB"/>
+        </w:rPr>
+        <w:t>CartItemRepository</w:t>
+      </w:r>
+      <w:r>
+        <w:rPr>
+          <w:lang w:val="en-GB"/>
+        </w:rPr>
+        <w:t xml:space="preserve"> (DB) → build response.</w:t>
+      </w:r>
+    </w:p>
+    <w:p>
+      <w:pPr>
+        <w:numPr>
+          <w:ilvl w:val="1"/>
+          <w:numId w:val="21"/>
+        </w:numPr>
+        <w:rPr>
+          <w:lang w:val="en-GB"/>
+        </w:rPr>
+      </w:pPr>
+      <w:r>
+        <w:rPr>
+          <w:lang w:val="en-GB"/>
+        </w:rPr>
+        <w:t>Gửi trả kafkaTemplate.send(topicResp, response).</w:t>
+      </w:r>
+    </w:p>
+    <w:p>
+      <w:pPr>
+        <w:numPr>
+          <w:ilvl w:val="0"/>
+          <w:numId w:val="21"/>
+        </w:numPr>
+        <w:rPr>
+          <w:lang w:val="en-GB"/>
+        </w:rPr>
+      </w:pPr>
+      <w:r>
+        <w:rPr>
+          <w:b/>
+          <w:bCs/>
+          <w:lang w:val="en-GB"/>
+        </w:rPr>
+        <w:t>checkout-service</w:t>
+      </w:r>
+      <w:r>
+        <w:rPr>
+          <w:lang w:val="en-GB"/>
+        </w:rPr>
+        <w:t xml:space="preserve"> có listener “hộp thư trả lời”:</w:t>
+      </w:r>
+    </w:p>
+    <w:p>
+      <w:pPr>
+        <w:numPr>
+          <w:ilvl w:val="1"/>
+          <w:numId w:val="21"/>
+        </w:numPr>
+        <w:rPr>
+          <w:lang w:val="en-GB"/>
+        </w:rPr>
+      </w:pPr>
+      <w:r>
+        <w:rPr>
+          <w:lang w:val="en-GB"/>
+        </w:rPr>
+        <w:t>ReplyInbox.onCart(CartGetResponse resp) → requestReplyClient.complete(correlationId, resp).</w:t>
+      </w:r>
+    </w:p>
+    <w:p>
+      <w:pPr>
+        <w:numPr>
+          <w:ilvl w:val="1"/>
+          <w:numId w:val="21"/>
+        </w:numPr>
+        <w:rPr>
+          <w:lang w:val="en-GB"/>
+        </w:rPr>
+      </w:pPr>
+      <w:r>
+        <w:rPr>
+          <w:lang w:val="en-GB"/>
+        </w:rPr>
+        <w:t xml:space="preserve">Thread đang .request(...) được trả kết quả để </w:t>
+      </w:r>
+      <w:r>
+        <w:rPr>
+          <w:b/>
+          <w:bCs/>
+          <w:lang w:val="en-GB"/>
+        </w:rPr>
+        <w:t>tiếp tục tính toán</w:t>
+      </w:r>
+      <w:r>
+        <w:rPr>
+          <w:lang w:val="en-GB"/>
+        </w:rPr>
+        <w:t xml:space="preserve"> trong </w:t>
+      </w:r>
+      <w:r>
+        <w:rPr>
+          <w:b/>
+          <w:bCs/>
+          <w:lang w:val="en-GB"/>
+        </w:rPr>
+        <w:t>CheckoutServiceImpl</w:t>
+      </w:r>
+      <w:r>
+        <w:rPr>
+          <w:lang w:val="en-GB"/>
+        </w:rPr>
+        <w:t>.</w:t>
+      </w:r>
+    </w:p>
+    <w:p>
+      <w:pPr>
+        <w:rPr>
+          <w:lang w:val="en-GB"/>
+        </w:rPr>
+      </w:pPr>
+      <w:r>
+        <w:rPr>
+          <w:b/>
+          <w:bCs/>
+          <w:lang w:val="en-GB"/>
+        </w:rPr>
+        <w:t>B. Event one-way (fire-and-forget)</w:t>
+      </w:r>
+    </w:p>
+    <w:p>
+      <w:pPr>
+        <w:numPr>
+          <w:ilvl w:val="0"/>
+          <w:numId w:val="22"/>
+        </w:numPr>
+        <w:rPr>
+          <w:lang w:val="en-GB"/>
+        </w:rPr>
+      </w:pPr>
+      <w:r>
+        <w:rPr>
+          <w:b/>
+          <w:bCs/>
+          <w:lang w:val="en-GB"/>
+        </w:rPr>
+        <w:t>Producer</w:t>
+      </w:r>
+      <w:r>
+        <w:rPr>
+          <w:lang w:val="en-GB"/>
+        </w:rPr>
+        <w:t xml:space="preserve"> publish sự kiện (không chờ trả lời), ví dụ:</w:t>
+      </w:r>
+    </w:p>
+    <w:p>
+      <w:pPr>
+        <w:numPr>
+          <w:ilvl w:val="1"/>
+          <w:numId w:val="22"/>
+        </w:numPr>
+        <w:rPr>
+          <w:lang w:val="en-GB"/>
+        </w:rPr>
+      </w:pPr>
+      <w:r>
+        <w:rPr>
+          <w:lang w:val="en-GB"/>
+        </w:rPr>
+        <w:t>checkout-service sau khi tính xong đơn COD: kafka.send(ORDER_EVENTS, OrderPlacedEvent).</w:t>
+      </w:r>
+    </w:p>
+    <w:p>
+      <w:pPr>
+        <w:numPr>
+          <w:ilvl w:val="0"/>
+          <w:numId w:val="22"/>
+        </w:numPr>
+        <w:rPr>
+          <w:lang w:val="en-GB"/>
+        </w:rPr>
+      </w:pPr>
+      <w:r>
+        <w:rPr>
+          <w:b/>
+          <w:bCs/>
+          <w:lang w:val="en-GB"/>
+        </w:rPr>
+        <w:t>Consumer</w:t>
+      </w:r>
+      <w:r>
+        <w:rPr>
+          <w:lang w:val="en-GB"/>
+        </w:rPr>
+        <w:t xml:space="preserve"> (ví dụ order-service) @KafkaListener:</w:t>
+      </w:r>
+    </w:p>
+    <w:p>
+      <w:pPr>
+        <w:numPr>
+          <w:ilvl w:val="1"/>
+          <w:numId w:val="22"/>
+        </w:numPr>
+        <w:rPr>
+          <w:lang w:val="en-GB"/>
+        </w:rPr>
+      </w:pPr>
+      <w:r>
+        <w:rPr>
+          <w:lang w:val="en-GB"/>
+        </w:rPr>
+        <w:t xml:space="preserve">OrderHandlers.onPlaced(...) → </w:t>
+      </w:r>
+      <w:r>
+        <w:rPr>
+          <w:b/>
+          <w:bCs/>
+          <w:lang w:val="en-GB"/>
+        </w:rPr>
+        <w:t>tạo Order</w:t>
+      </w:r>
+      <w:r>
+        <w:rPr>
+          <w:lang w:val="en-GB"/>
+        </w:rPr>
+        <w:t xml:space="preserve"> → </w:t>
+      </w:r>
+      <w:r>
+        <w:rPr>
+          <w:b/>
+          <w:bCs/>
+          <w:lang w:val="en-GB"/>
+        </w:rPr>
+        <w:t>OrderRepository.save</w:t>
+      </w:r>
+      <w:r>
+        <w:rPr>
+          <w:lang w:val="en-GB"/>
+        </w:rPr>
+        <w:t xml:space="preserve"> → thêm </w:t>
+      </w:r>
+      <w:r>
+        <w:rPr>
+          <w:b/>
+          <w:bCs/>
+          <w:lang w:val="en-GB"/>
+        </w:rPr>
+        <w:t>OrderTrack</w:t>
+      </w:r>
+      <w:r>
+        <w:rPr>
+          <w:lang w:val="en-GB"/>
+        </w:rPr>
+        <w:t>.</w:t>
+      </w:r>
+    </w:p>
+    <w:p>
+      <w:pPr>
+        <w:numPr>
+          <w:ilvl w:val="1"/>
+          <w:numId w:val="22"/>
+        </w:numPr>
+        <w:rPr>
+          <w:lang w:val="en-GB"/>
+        </w:rPr>
+      </w:pPr>
+      <w:r>
+        <w:rPr>
+          <w:lang w:val="en-GB"/>
+        </w:rPr>
+        <w:t>(Không reply).</w:t>
+      </w:r>
+    </w:p>
+    <w:p>
+      <w:pPr>
+        <w:rPr>
+          <w:lang w:val="en-GB"/>
+        </w:rPr>
+      </w:pPr>
+      <w:r>
+        <w:rPr>
+          <w:b/>
+          <w:bCs/>
+          <w:lang w:val="en-GB"/>
+        </w:rPr>
+        <w:t>C. Broadcast/Fan-out</w:t>
+      </w:r>
+    </w:p>
+    <w:p>
+      <w:pPr>
+        <w:numPr>
+          <w:ilvl w:val="0"/>
+          <w:numId w:val="23"/>
+        </w:numPr>
+        <w:rPr>
+          <w:lang w:val="en-GB"/>
+        </w:rPr>
+      </w:pPr>
+      <w:r>
+        <w:rPr>
+          <w:b/>
+          <w:bCs/>
+          <w:lang w:val="en-GB"/>
+        </w:rPr>
+        <w:t>review-service</w:t>
+      </w:r>
+      <w:r>
+        <w:rPr>
+          <w:lang w:val="en-GB"/>
+        </w:rPr>
+        <w:t xml:space="preserve"> sau khi tạo/sửa/xóa review:</w:t>
+      </w:r>
+    </w:p>
+    <w:p>
+      <w:pPr>
+        <w:numPr>
+          <w:ilvl w:val="1"/>
+          <w:numId w:val="23"/>
+        </w:numPr>
+        <w:rPr>
+          <w:lang w:val="en-GB"/>
+        </w:rPr>
+      </w:pPr>
+      <w:r>
+        <w:rPr>
+          <w:lang w:val="en-GB"/>
+        </w:rPr>
+        <w:t>kafka.send(REVIEW_STATS_CHANGED, new ReviewStatsChanged(productId)).</w:t>
+      </w:r>
+    </w:p>
+    <w:p>
+      <w:pPr>
+        <w:numPr>
+          <w:ilvl w:val="0"/>
+          <w:numId w:val="23"/>
+        </w:numPr>
+        <w:rPr>
+          <w:lang w:val="en-GB"/>
+        </w:rPr>
+      </w:pPr>
+      <w:r>
+        <w:rPr>
+          <w:b/>
+          <w:bCs/>
+          <w:lang w:val="en-GB"/>
+        </w:rPr>
+        <w:t>catalog-service</w:t>
+      </w:r>
+      <w:r>
+        <w:rPr>
+          <w:lang w:val="en-GB"/>
+        </w:rPr>
+        <w:t xml:space="preserve"> có listener:</w:t>
+      </w:r>
+    </w:p>
+    <w:p>
+      <w:pPr>
+        <w:numPr>
+          <w:ilvl w:val="1"/>
+          <w:numId w:val="23"/>
+        </w:numPr>
+        <w:rPr>
+          <w:lang w:val="en-GB"/>
+        </w:rPr>
+      </w:pPr>
+      <w:r>
+        <w:rPr>
+          <w:lang w:val="en-GB"/>
+        </w:rPr>
+        <w:lastRenderedPageBreak/>
+        <w:t xml:space="preserve">Update averageRating/reviewCount trong </w:t>
+      </w:r>
+      <w:r>
+        <w:rPr>
+          <w:b/>
+          <w:bCs/>
+          <w:lang w:val="en-GB"/>
+        </w:rPr>
+        <w:t>ProductRepository</w:t>
+      </w:r>
+      <w:r>
+        <w:rPr>
+          <w:lang w:val="en-GB"/>
+        </w:rPr>
+        <w:t xml:space="preserve"> (logic ở service của catalog).</w:t>
+      </w:r>
+    </w:p>
+    <w:p>
+      <w:pPr>
+        <w:rPr>
+          <w:lang w:val="en-GB"/>
+        </w:rPr>
+      </w:pPr>
+      <w:r>
+        <w:rPr>
+          <w:lang w:val="en-GB"/>
+        </w:rPr>
+        <w:t xml:space="preserve">Kết luận: </w:t>
+      </w:r>
+      <w:r>
+        <w:rPr>
+          <w:b/>
+          <w:bCs/>
+          <w:lang w:val="en-GB"/>
+        </w:rPr>
+        <w:t>logic luôn chạy trong code của service nhận</w:t>
+      </w:r>
+      <w:r>
+        <w:rPr>
+          <w:lang w:val="en-GB"/>
+        </w:rPr>
+        <w:t xml:space="preserve"> (ở lớp Service/Repo của chính service đó). Kafka </w:t>
+      </w:r>
+      <w:r>
+        <w:rPr>
+          <w:b/>
+          <w:bCs/>
+          <w:lang w:val="en-GB"/>
+        </w:rPr>
+        <w:t>không chạy logic</w:t>
+      </w:r>
+      <w:r>
+        <w:rPr>
+          <w:lang w:val="en-GB"/>
+        </w:rPr>
+        <w:t>.</w:t>
+      </w:r>
+    </w:p>
+    <w:p/>
+    <w:p/>
+    <w:p>
+      <w:r>
+        <w:t>kafka-topics.sh --create --topic eshop.catalog.product.snapshot.req --bootstrap-server localhost:9092 --partitions 1 --replication-factor 1</w:t>
+      </w:r>
+    </w:p>
+    <w:p>
+      <w:r>
+        <w:t>kafka-topics.sh --create --topic eshop.catalog.product.snapshot.resp --bootstrap-server localhost:9092 --partitions 1 --replication-factor 1</w:t>
+      </w:r>
+    </w:p>
+    <w:p/>
+    <w:p>
+      <w:r>
+        <w:t>kafka-topics.sh --create --topic eshop.customer.address.req --bootstrap-server localhost:9092 --partitions 1 --replication-factor 1</w:t>
+      </w:r>
+    </w:p>
+    <w:p>
+      <w:r>
+        <w:t>kafka-topics.sh --create --topic eshop.customer.address.resp --bootstrap-server localhost:9092 --partitions 1 --replication-factor 1</w:t>
+      </w:r>
+    </w:p>
+    <w:p/>
+    <w:p>
+      <w:r>
+        <w:t>kafka-topics.sh --create --topic eshop.order.events --bootstrap-server localhost:9092 --partitions 1 --replication-factor 1</w:t>
+      </w:r>
+    </w:p>
     <w:sectPr>
       <w:pgSz w:w="12240" w:h="15840"/>
       <w:pgMar w:top="1440" w:right="1800" w:bottom="1440" w:left="1800" w:header="720" w:footer="720" w:gutter="0"/>
@@ -610,6 +1290,56 @@
     </w:sectPr>
   </w:body>
 </w:document>
+</file>
+
+<file path=word/endnotes.xml><?xml version="1.0" encoding="utf-8"?>
+<w:endnotes xmlns:wpc="http://schemas.microsoft.com/office/word/2010/wordprocessingCanvas" xmlns:cx="http://schemas.microsoft.com/office/drawing/2014/chartex" xmlns:cx1="http://schemas.microsoft.com/office/drawing/2015/9/8/chartex" xmlns:cx2="http://schemas.microsoft.com/office/drawing/2015/10/21/chartex" xmlns:cx3="http://schemas.microsoft.com/office/drawing/2016/5/9/chartex" xmlns:cx4="http://schemas.microsoft.com/office/drawing/2016/5/10/chartex" xmlns:cx5="http://schemas.microsoft.com/office/drawing/2016/5/11/chartex" xmlns:cx6="http://schemas.microsoft.com/office/drawing/2016/5/12/chartex" xmlns:cx7="http://schemas.microsoft.com/office/drawing/2016/5/13/chartex" xmlns:cx8="http://schemas.microsoft.com/office/drawing/2016/5/14/chartex" xmlns:mc="http://schemas.openxmlformats.org/markup-compatibility/2006" xmlns:aink="http://schemas.microsoft.com/office/drawing/2016/ink" xmlns:am3d="http://schemas.microsoft.com/office/drawing/2017/model3d" xmlns:o="urn:schemas-microsoft-com:office:office" xmlns:oel="http://schemas.microsoft.com/office/2019/extlst" xmlns:r="http://schemas.openxmlformats.org/officeDocument/2006/relationships" xmlns:m="http://schemas.openxmlformats.org/officeDocument/2006/math" xmlns:v="urn:schemas-microsoft-com:vml" xmlns:wp14="http://schemas.microsoft.com/office/word/2010/wordprocessingDrawing" xmlns:wp="http://schemas.openxmlformats.org/drawingml/2006/wordprocessingDrawing" xmlns:w10="urn:schemas-microsoft-com:office:word" xmlns:w="http://schemas.openxmlformats.org/wordprocessingml/2006/main" xmlns:w14="http://schemas.microsoft.com/office/word/2010/wordml" xmlns:w15="http://schemas.microsoft.com/office/word/2012/wordml" xmlns:w16cex="http://schemas.microsoft.com/office/word/2018/wordml/cex" xmlns:w16cid="http://schemas.microsoft.com/office/word/2016/wordml/cid" xmlns:w16="http://schemas.microsoft.com/office/word/2018/wordml" xmlns:w16du="http://schemas.microsoft.com/office/word/2023/wordml/word16du" xmlns:w16sdtdh="http://schemas.microsoft.com/office/word/2020/wordml/sdtdatahash" xmlns:w16sdtfl="http://schemas.microsoft.com/office/word/2024/wordml/sdtformatlock" xmlns:w16se="http://schemas.microsoft.com/office/word/2015/wordml/symex" xmlns:wpg="http://schemas.microsoft.com/office/word/2010/wordprocessingGroup" xmlns:wpi="http://schemas.microsoft.com/office/word/2010/wordprocessingInk" xmlns:wne="http://schemas.microsoft.com/office/word/2006/wordml" xmlns:wps="http://schemas.microsoft.com/office/word/2010/wordprocessingShape" mc:Ignorable="w14 w15 w16se w16cid w16 w16cex w16sdtdh w16sdtfl w16du wp14">
+  <w:endnote w:type="separator" w:id="-1">
+    <w:p>
+      <w:pPr>
+        <w:spacing w:after="0" w:line="240" w:lineRule="auto"/>
+      </w:pPr>
+      <w:r>
+        <w:separator/>
+      </w:r>
+    </w:p>
+  </w:endnote>
+  <w:endnote w:type="continuationSeparator" w:id="0">
+    <w:p>
+      <w:pPr>
+        <w:spacing w:after="0" w:line="240" w:lineRule="auto"/>
+      </w:pPr>
+      <w:r>
+        <w:continuationSeparator/>
+      </w:r>
+    </w:p>
+  </w:endnote>
+</w:endnotes>
+</file>
+
+<file path=word/footnotes.xml><?xml version="1.0" encoding="utf-8"?>
+<w:footnotes xmlns:wpc="http://schemas.microsoft.com/office/word/2010/wordprocessingCanvas" xmlns:cx="http://schemas.microsoft.com/office/drawing/2014/chartex" xmlns:cx1="http://schemas.microsoft.com/office/drawing/2015/9/8/chartex" xmlns:cx2="http://schemas.microsoft.com/office/drawing/2015/10/21/chartex" xmlns:cx3="http://schemas.microsoft.com/office/drawing/2016/5/9/chartex" xmlns:cx4="http://schemas.microsoft.com/office/drawing/2016/5/10/chartex" xmlns:cx5="http://schemas.microsoft.com/office/drawing/2016/5/11/chartex" xmlns:cx6="http://schemas.microsoft.com/office/drawing/2016/5/12/chartex" xmlns:cx7="http://schemas.microsoft.com/office/drawing/2016/5/13/chartex" xmlns:cx8="http://schemas.microsoft.com/office/drawing/2016/5/14/chartex" xmlns:mc="http://schemas.openxmlformats.org/markup-compatibility/2006" xmlns:aink="http://schemas.microsoft.com/office/drawing/2016/ink" xmlns:am3d="http://schemas.microsoft.com/office/drawing/2017/model3d" xmlns:o="urn:schemas-microsoft-com:office:office" xmlns:oel="http://schemas.microsoft.com/office/2019/extlst" xmlns:r="http://schemas.openxmlformats.org/officeDocument/2006/relationships" xmlns:m="http://schemas.openxmlformats.org/officeDocument/2006/math" xmlns:v="urn:schemas-microsoft-com:vml" xmlns:wp14="http://schemas.microsoft.com/office/word/2010/wordprocessingDrawing" xmlns:wp="http://schemas.openxmlformats.org/drawingml/2006/wordprocessingDrawing" xmlns:w10="urn:schemas-microsoft-com:office:word" xmlns:w="http://schemas.openxmlformats.org/wordprocessingml/2006/main" xmlns:w14="http://schemas.microsoft.com/office/word/2010/wordml" xmlns:w15="http://schemas.microsoft.com/office/word/2012/wordml" xmlns:w16cex="http://schemas.microsoft.com/office/word/2018/wordml/cex" xmlns:w16cid="http://schemas.microsoft.com/office/word/2016/wordml/cid" xmlns:w16="http://schemas.microsoft.com/office/word/2018/wordml" xmlns:w16du="http://schemas.microsoft.com/office/word/2023/wordml/word16du" xmlns:w16sdtdh="http://schemas.microsoft.com/office/word/2020/wordml/sdtdatahash" xmlns:w16sdtfl="http://schemas.microsoft.com/office/word/2024/wordml/sdtformatlock" xmlns:w16se="http://schemas.microsoft.com/office/word/2015/wordml/symex" xmlns:wpg="http://schemas.microsoft.com/office/word/2010/wordprocessingGroup" xmlns:wpi="http://schemas.microsoft.com/office/word/2010/wordprocessingInk" xmlns:wne="http://schemas.microsoft.com/office/word/2006/wordml" xmlns:wps="http://schemas.microsoft.com/office/word/2010/wordprocessingShape" mc:Ignorable="w14 w15 w16se w16cid w16 w16cex w16sdtdh w16sdtfl w16du wp14">
+  <w:footnote w:type="separator" w:id="-1">
+    <w:p>
+      <w:pPr>
+        <w:spacing w:after="0" w:line="240" w:lineRule="auto"/>
+      </w:pPr>
+      <w:r>
+        <w:separator/>
+      </w:r>
+    </w:p>
+  </w:footnote>
+  <w:footnote w:type="continuationSeparator" w:id="0">
+    <w:p>
+      <w:pPr>
+        <w:spacing w:after="0" w:line="240" w:lineRule="auto"/>
+      </w:pPr>
+      <w:r>
+        <w:continuationSeparator/>
+      </w:r>
+    </w:p>
+  </w:footnote>
+</w:footnotes>
 </file>
 
 <file path=word/numbering.xml><?xml version="1.0" encoding="utf-8"?>
@@ -786,6 +1516,123 @@
     </w:lvl>
   </w:abstractNum>
   <w:abstractNum w:abstractNumId="9" w15:restartNumberingAfterBreak="0">
+    <w:nsid w:val="03410075"/>
+    <w:multiLevelType w:val="multilevel"/>
+    <w:tmpl w:val="542689E0"/>
+    <w:lvl w:ilvl="0">
+      <w:start w:val="1"/>
+      <w:numFmt w:val="decimal"/>
+      <w:lvlText w:val="%1."/>
+      <w:lvlJc w:val="left"/>
+      <w:pPr>
+        <w:tabs>
+          <w:tab w:val="num" w:pos="720"/>
+        </w:tabs>
+        <w:ind w:left="720" w:hanging="360"/>
+      </w:pPr>
+    </w:lvl>
+    <w:lvl w:ilvl="1">
+      <w:start w:val="1"/>
+      <w:numFmt w:val="bullet"/>
+      <w:lvlText w:val="o"/>
+      <w:lvlJc w:val="left"/>
+      <w:pPr>
+        <w:tabs>
+          <w:tab w:val="num" w:pos="1440"/>
+        </w:tabs>
+        <w:ind w:left="1440" w:hanging="360"/>
+      </w:pPr>
+      <w:rPr>
+        <w:rFonts w:ascii="Courier New" w:hAnsi="Courier New" w:hint="default"/>
+        <w:sz w:val="20"/>
+      </w:rPr>
+    </w:lvl>
+    <w:lvl w:ilvl="2" w:tentative="1">
+      <w:start w:val="1"/>
+      <w:numFmt w:val="decimal"/>
+      <w:lvlText w:val="%3."/>
+      <w:lvlJc w:val="left"/>
+      <w:pPr>
+        <w:tabs>
+          <w:tab w:val="num" w:pos="2160"/>
+        </w:tabs>
+        <w:ind w:left="2160" w:hanging="360"/>
+      </w:pPr>
+    </w:lvl>
+    <w:lvl w:ilvl="3" w:tentative="1">
+      <w:start w:val="1"/>
+      <w:numFmt w:val="decimal"/>
+      <w:lvlText w:val="%4."/>
+      <w:lvlJc w:val="left"/>
+      <w:pPr>
+        <w:tabs>
+          <w:tab w:val="num" w:pos="2880"/>
+        </w:tabs>
+        <w:ind w:left="2880" w:hanging="360"/>
+      </w:pPr>
+    </w:lvl>
+    <w:lvl w:ilvl="4" w:tentative="1">
+      <w:start w:val="1"/>
+      <w:numFmt w:val="decimal"/>
+      <w:lvlText w:val="%5."/>
+      <w:lvlJc w:val="left"/>
+      <w:pPr>
+        <w:tabs>
+          <w:tab w:val="num" w:pos="3600"/>
+        </w:tabs>
+        <w:ind w:left="3600" w:hanging="360"/>
+      </w:pPr>
+    </w:lvl>
+    <w:lvl w:ilvl="5" w:tentative="1">
+      <w:start w:val="1"/>
+      <w:numFmt w:val="decimal"/>
+      <w:lvlText w:val="%6."/>
+      <w:lvlJc w:val="left"/>
+      <w:pPr>
+        <w:tabs>
+          <w:tab w:val="num" w:pos="4320"/>
+        </w:tabs>
+        <w:ind w:left="4320" w:hanging="360"/>
+      </w:pPr>
+    </w:lvl>
+    <w:lvl w:ilvl="6" w:tentative="1">
+      <w:start w:val="1"/>
+      <w:numFmt w:val="decimal"/>
+      <w:lvlText w:val="%7."/>
+      <w:lvlJc w:val="left"/>
+      <w:pPr>
+        <w:tabs>
+          <w:tab w:val="num" w:pos="5040"/>
+        </w:tabs>
+        <w:ind w:left="5040" w:hanging="360"/>
+      </w:pPr>
+    </w:lvl>
+    <w:lvl w:ilvl="7" w:tentative="1">
+      <w:start w:val="1"/>
+      <w:numFmt w:val="decimal"/>
+      <w:lvlText w:val="%8."/>
+      <w:lvlJc w:val="left"/>
+      <w:pPr>
+        <w:tabs>
+          <w:tab w:val="num" w:pos="5760"/>
+        </w:tabs>
+        <w:ind w:left="5760" w:hanging="360"/>
+      </w:pPr>
+    </w:lvl>
+    <w:lvl w:ilvl="8" w:tentative="1">
+      <w:start w:val="1"/>
+      <w:numFmt w:val="decimal"/>
+      <w:lvlText w:val="%9."/>
+      <w:lvlJc w:val="left"/>
+      <w:pPr>
+        <w:tabs>
+          <w:tab w:val="num" w:pos="6480"/>
+        </w:tabs>
+        <w:ind w:left="6480" w:hanging="360"/>
+      </w:pPr>
+    </w:lvl>
+  </w:abstractNum>
+  <w:abstractNum w:abstractNumId="10" w15:restartNumberingAfterBreak="0">
     <w:nsid w:val="04E32E3A"/>
     <w:multiLevelType w:val="multilevel"/>
     <w:tmpl w:val="55A28836"/>
@@ -934,7 +1781,7 @@
       </w:rPr>
     </w:lvl>
   </w:abstractNum>
-  <w:abstractNum w:abstractNumId="10" w15:restartNumberingAfterBreak="0">
+  <w:abstractNum w:abstractNumId="11" w15:restartNumberingAfterBreak="0">
     <w:nsid w:val="084F62E0"/>
     <w:multiLevelType w:val="multilevel"/>
     <w:tmpl w:val="D9CE6346"/>
@@ -1083,7 +1930,7 @@
       </w:rPr>
     </w:lvl>
   </w:abstractNum>
-  <w:abstractNum w:abstractNumId="11" w15:restartNumberingAfterBreak="0">
+  <w:abstractNum w:abstractNumId="12" w15:restartNumberingAfterBreak="0">
     <w:nsid w:val="14E72912"/>
     <w:multiLevelType w:val="multilevel"/>
     <w:tmpl w:val="809C5A90"/>
@@ -1232,7 +2079,7 @@
       </w:rPr>
     </w:lvl>
   </w:abstractNum>
-  <w:abstractNum w:abstractNumId="12" w15:restartNumberingAfterBreak="0">
+  <w:abstractNum w:abstractNumId="13" w15:restartNumberingAfterBreak="0">
     <w:nsid w:val="43A72B7F"/>
     <w:multiLevelType w:val="multilevel"/>
     <w:tmpl w:val="D14CEA00"/>
@@ -1381,7 +2228,241 @@
       </w:rPr>
     </w:lvl>
   </w:abstractNum>
-  <w:abstractNum w:abstractNumId="13" w15:restartNumberingAfterBreak="0">
+  <w:abstractNum w:abstractNumId="14" w15:restartNumberingAfterBreak="0">
+    <w:nsid w:val="43B37C36"/>
+    <w:multiLevelType w:val="multilevel"/>
+    <w:tmpl w:val="0DF608CE"/>
+    <w:lvl w:ilvl="0">
+      <w:start w:val="1"/>
+      <w:numFmt w:val="decimal"/>
+      <w:lvlText w:val="%1."/>
+      <w:lvlJc w:val="left"/>
+      <w:pPr>
+        <w:tabs>
+          <w:tab w:val="num" w:pos="720"/>
+        </w:tabs>
+        <w:ind w:left="720" w:hanging="360"/>
+      </w:pPr>
+    </w:lvl>
+    <w:lvl w:ilvl="1">
+      <w:start w:val="1"/>
+      <w:numFmt w:val="bullet"/>
+      <w:lvlText w:val="o"/>
+      <w:lvlJc w:val="left"/>
+      <w:pPr>
+        <w:tabs>
+          <w:tab w:val="num" w:pos="1440"/>
+        </w:tabs>
+        <w:ind w:left="1440" w:hanging="360"/>
+      </w:pPr>
+      <w:rPr>
+        <w:rFonts w:ascii="Courier New" w:hAnsi="Courier New" w:hint="default"/>
+        <w:sz w:val="20"/>
+      </w:rPr>
+    </w:lvl>
+    <w:lvl w:ilvl="2" w:tentative="1">
+      <w:start w:val="1"/>
+      <w:numFmt w:val="decimal"/>
+      <w:lvlText w:val="%3."/>
+      <w:lvlJc w:val="left"/>
+      <w:pPr>
+        <w:tabs>
+          <w:tab w:val="num" w:pos="2160"/>
+        </w:tabs>
+        <w:ind w:left="2160" w:hanging="360"/>
+      </w:pPr>
+    </w:lvl>
+    <w:lvl w:ilvl="3" w:tentative="1">
+      <w:start w:val="1"/>
+      <w:numFmt w:val="decimal"/>
+      <w:lvlText w:val="%4."/>
+      <w:lvlJc w:val="left"/>
+      <w:pPr>
+        <w:tabs>
+          <w:tab w:val="num" w:pos="2880"/>
+        </w:tabs>
+        <w:ind w:left="2880" w:hanging="360"/>
+      </w:pPr>
+    </w:lvl>
+    <w:lvl w:ilvl="4" w:tentative="1">
+      <w:start w:val="1"/>
+      <w:numFmt w:val="decimal"/>
+      <w:lvlText w:val="%5."/>
+      <w:lvlJc w:val="left"/>
+      <w:pPr>
+        <w:tabs>
+          <w:tab w:val="num" w:pos="3600"/>
+        </w:tabs>
+        <w:ind w:left="3600" w:hanging="360"/>
+      </w:pPr>
+    </w:lvl>
+    <w:lvl w:ilvl="5" w:tentative="1">
+      <w:start w:val="1"/>
+      <w:numFmt w:val="decimal"/>
+      <w:lvlText w:val="%6."/>
+      <w:lvlJc w:val="left"/>
+      <w:pPr>
+        <w:tabs>
+          <w:tab w:val="num" w:pos="4320"/>
+        </w:tabs>
+        <w:ind w:left="4320" w:hanging="360"/>
+      </w:pPr>
+    </w:lvl>
+    <w:lvl w:ilvl="6" w:tentative="1">
+      <w:start w:val="1"/>
+      <w:numFmt w:val="decimal"/>
+      <w:lvlText w:val="%7."/>
+      <w:lvlJc w:val="left"/>
+      <w:pPr>
+        <w:tabs>
+          <w:tab w:val="num" w:pos="5040"/>
+        </w:tabs>
+        <w:ind w:left="5040" w:hanging="360"/>
+      </w:pPr>
+    </w:lvl>
+    <w:lvl w:ilvl="7" w:tentative="1">
+      <w:start w:val="1"/>
+      <w:numFmt w:val="decimal"/>
+      <w:lvlText w:val="%8."/>
+      <w:lvlJc w:val="left"/>
+      <w:pPr>
+        <w:tabs>
+          <w:tab w:val="num" w:pos="5760"/>
+        </w:tabs>
+        <w:ind w:left="5760" w:hanging="360"/>
+      </w:pPr>
+    </w:lvl>
+    <w:lvl w:ilvl="8" w:tentative="1">
+      <w:start w:val="1"/>
+      <w:numFmt w:val="decimal"/>
+      <w:lvlText w:val="%9."/>
+      <w:lvlJc w:val="left"/>
+      <w:pPr>
+        <w:tabs>
+          <w:tab w:val="num" w:pos="6480"/>
+        </w:tabs>
+        <w:ind w:left="6480" w:hanging="360"/>
+      </w:pPr>
+    </w:lvl>
+  </w:abstractNum>
+  <w:abstractNum w:abstractNumId="15" w15:restartNumberingAfterBreak="0">
+    <w:nsid w:val="51BD0FDF"/>
+    <w:multiLevelType w:val="multilevel"/>
+    <w:tmpl w:val="3462E0DE"/>
+    <w:lvl w:ilvl="0">
+      <w:start w:val="1"/>
+      <w:numFmt w:val="decimal"/>
+      <w:lvlText w:val="%1."/>
+      <w:lvlJc w:val="left"/>
+      <w:pPr>
+        <w:tabs>
+          <w:tab w:val="num" w:pos="720"/>
+        </w:tabs>
+        <w:ind w:left="720" w:hanging="360"/>
+      </w:pPr>
+    </w:lvl>
+    <w:lvl w:ilvl="1">
+      <w:start w:val="1"/>
+      <w:numFmt w:val="bullet"/>
+      <w:lvlText w:val="o"/>
+      <w:lvlJc w:val="left"/>
+      <w:pPr>
+        <w:tabs>
+          <w:tab w:val="num" w:pos="1440"/>
+        </w:tabs>
+        <w:ind w:left="1440" w:hanging="360"/>
+      </w:pPr>
+      <w:rPr>
+        <w:rFonts w:ascii="Courier New" w:hAnsi="Courier New" w:hint="default"/>
+        <w:sz w:val="20"/>
+      </w:rPr>
+    </w:lvl>
+    <w:lvl w:ilvl="2" w:tentative="1">
+      <w:start w:val="1"/>
+      <w:numFmt w:val="decimal"/>
+      <w:lvlText w:val="%3."/>
+      <w:lvlJc w:val="left"/>
+      <w:pPr>
+        <w:tabs>
+          <w:tab w:val="num" w:pos="2160"/>
+        </w:tabs>
+        <w:ind w:left="2160" w:hanging="360"/>
+      </w:pPr>
+    </w:lvl>
+    <w:lvl w:ilvl="3" w:tentative="1">
+      <w:start w:val="1"/>
+      <w:numFmt w:val="decimal"/>
+      <w:lvlText w:val="%4."/>
+      <w:lvlJc w:val="left"/>
+      <w:pPr>
+        <w:tabs>
+          <w:tab w:val="num" w:pos="2880"/>
+        </w:tabs>
+        <w:ind w:left="2880" w:hanging="360"/>
+      </w:pPr>
+    </w:lvl>
+    <w:lvl w:ilvl="4" w:tentative="1">
+      <w:start w:val="1"/>
+      <w:numFmt w:val="decimal"/>
+      <w:lvlText w:val="%5."/>
+      <w:lvlJc w:val="left"/>
+      <w:pPr>
+        <w:tabs>
+          <w:tab w:val="num" w:pos="3600"/>
+        </w:tabs>
+        <w:ind w:left="3600" w:hanging="360"/>
+      </w:pPr>
+    </w:lvl>
+    <w:lvl w:ilvl="5" w:tentative="1">
+      <w:start w:val="1"/>
+      <w:numFmt w:val="decimal"/>
+      <w:lvlText w:val="%6."/>
+      <w:lvlJc w:val="left"/>
+      <w:pPr>
+        <w:tabs>
+          <w:tab w:val="num" w:pos="4320"/>
+        </w:tabs>
+        <w:ind w:left="4320" w:hanging="360"/>
+      </w:pPr>
+    </w:lvl>
+    <w:lvl w:ilvl="6" w:tentative="1">
+      <w:start w:val="1"/>
+      <w:numFmt w:val="decimal"/>
+      <w:lvlText w:val="%7."/>
+      <w:lvlJc w:val="left"/>
+      <w:pPr>
+        <w:tabs>
+          <w:tab w:val="num" w:pos="5040"/>
+        </w:tabs>
+        <w:ind w:left="5040" w:hanging="360"/>
+      </w:pPr>
+    </w:lvl>
+    <w:lvl w:ilvl="7" w:tentative="1">
+      <w:start w:val="1"/>
+      <w:numFmt w:val="decimal"/>
+      <w:lvlText w:val="%8."/>
+      <w:lvlJc w:val="left"/>
+      <w:pPr>
+        <w:tabs>
+          <w:tab w:val="num" w:pos="5760"/>
+        </w:tabs>
+        <w:ind w:left="5760" w:hanging="360"/>
+      </w:pPr>
+    </w:lvl>
+    <w:lvl w:ilvl="8" w:tentative="1">
+      <w:start w:val="1"/>
+      <w:numFmt w:val="decimal"/>
+      <w:lvlText w:val="%9."/>
+      <w:lvlJc w:val="left"/>
+      <w:pPr>
+        <w:tabs>
+          <w:tab w:val="num" w:pos="6480"/>
+        </w:tabs>
+        <w:ind w:left="6480" w:hanging="360"/>
+      </w:pPr>
+    </w:lvl>
+  </w:abstractNum>
+  <w:abstractNum w:abstractNumId="16" w15:restartNumberingAfterBreak="0">
     <w:nsid w:val="546D2FBF"/>
     <w:multiLevelType w:val="multilevel"/>
     <w:tmpl w:val="DCEA799E"/>
@@ -1530,7 +2611,7 @@
       </w:rPr>
     </w:lvl>
   </w:abstractNum>
-  <w:abstractNum w:abstractNumId="14" w15:restartNumberingAfterBreak="0">
+  <w:abstractNum w:abstractNumId="17" w15:restartNumberingAfterBreak="0">
     <w:nsid w:val="5FB4586F"/>
     <w:multiLevelType w:val="multilevel"/>
     <w:tmpl w:val="A41AE636"/>
@@ -1679,7 +2760,7 @@
       </w:rPr>
     </w:lvl>
   </w:abstractNum>
-  <w:abstractNum w:abstractNumId="15" w15:restartNumberingAfterBreak="0">
+  <w:abstractNum w:abstractNumId="18" w15:restartNumberingAfterBreak="0">
     <w:nsid w:val="651B19F2"/>
     <w:multiLevelType w:val="multilevel"/>
     <w:tmpl w:val="14BA8708"/>
@@ -1828,7 +2909,7 @@
       </w:rPr>
     </w:lvl>
   </w:abstractNum>
-  <w:abstractNum w:abstractNumId="16" w15:restartNumberingAfterBreak="0">
+  <w:abstractNum w:abstractNumId="19" w15:restartNumberingAfterBreak="0">
     <w:nsid w:val="6B740BAE"/>
     <w:multiLevelType w:val="multilevel"/>
     <w:tmpl w:val="791C96CE"/>
@@ -1977,7 +3058,7 @@
       </w:rPr>
     </w:lvl>
   </w:abstractNum>
-  <w:abstractNum w:abstractNumId="17" w15:restartNumberingAfterBreak="0">
+  <w:abstractNum w:abstractNumId="20" w15:restartNumberingAfterBreak="0">
     <w:nsid w:val="6FB37B81"/>
     <w:multiLevelType w:val="multilevel"/>
     <w:tmpl w:val="9BF20528"/>
@@ -2126,7 +3207,7 @@
       </w:rPr>
     </w:lvl>
   </w:abstractNum>
-  <w:abstractNum w:abstractNumId="18" w15:restartNumberingAfterBreak="0">
+  <w:abstractNum w:abstractNumId="21" w15:restartNumberingAfterBreak="0">
     <w:nsid w:val="706D5C18"/>
     <w:multiLevelType w:val="multilevel"/>
     <w:tmpl w:val="7C96E640"/>
@@ -2275,7 +3356,7 @@
       </w:rPr>
     </w:lvl>
   </w:abstractNum>
-  <w:abstractNum w:abstractNumId="19" w15:restartNumberingAfterBreak="0">
+  <w:abstractNum w:abstractNumId="22" w15:restartNumberingAfterBreak="0">
     <w:nsid w:val="71A76448"/>
     <w:multiLevelType w:val="multilevel"/>
     <w:tmpl w:val="BDCE3FF2"/>
@@ -2452,37 +3533,46 @@
     <w:abstractNumId w:val="0"/>
   </w:num>
   <w:num w:numId="10" w16cid:durableId="494300633">
+    <w:abstractNumId w:val="20"/>
+  </w:num>
+  <w:num w:numId="11" w16cid:durableId="324088927">
     <w:abstractNumId w:val="17"/>
   </w:num>
-  <w:num w:numId="11" w16cid:durableId="324088927">
+  <w:num w:numId="12" w16cid:durableId="2067214121">
+    <w:abstractNumId w:val="19"/>
+  </w:num>
+  <w:num w:numId="13" w16cid:durableId="337662243">
+    <w:abstractNumId w:val="10"/>
+  </w:num>
+  <w:num w:numId="14" w16cid:durableId="1768040530">
+    <w:abstractNumId w:val="18"/>
+  </w:num>
+  <w:num w:numId="15" w16cid:durableId="1803383064">
+    <w:abstractNumId w:val="11"/>
+  </w:num>
+  <w:num w:numId="16" w16cid:durableId="1891378663">
+    <w:abstractNumId w:val="21"/>
+  </w:num>
+  <w:num w:numId="17" w16cid:durableId="111632564">
+    <w:abstractNumId w:val="16"/>
+  </w:num>
+  <w:num w:numId="18" w16cid:durableId="1441531950">
+    <w:abstractNumId w:val="12"/>
+  </w:num>
+  <w:num w:numId="19" w16cid:durableId="994840371">
+    <w:abstractNumId w:val="22"/>
+  </w:num>
+  <w:num w:numId="20" w16cid:durableId="1100905818">
+    <w:abstractNumId w:val="13"/>
+  </w:num>
+  <w:num w:numId="21" w16cid:durableId="1559585386">
+    <w:abstractNumId w:val="9"/>
+  </w:num>
+  <w:num w:numId="22" w16cid:durableId="540945209">
     <w:abstractNumId w:val="14"/>
   </w:num>
-  <w:num w:numId="12" w16cid:durableId="2067214121">
-    <w:abstractNumId w:val="16"/>
-  </w:num>
-  <w:num w:numId="13" w16cid:durableId="337662243">
-    <w:abstractNumId w:val="9"/>
-  </w:num>
-  <w:num w:numId="14" w16cid:durableId="1768040530">
+  <w:num w:numId="23" w16cid:durableId="846138121">
     <w:abstractNumId w:val="15"/>
-  </w:num>
-  <w:num w:numId="15" w16cid:durableId="1803383064">
-    <w:abstractNumId w:val="10"/>
-  </w:num>
-  <w:num w:numId="16" w16cid:durableId="1891378663">
-    <w:abstractNumId w:val="18"/>
-  </w:num>
-  <w:num w:numId="17" w16cid:durableId="111632564">
-    <w:abstractNumId w:val="13"/>
-  </w:num>
-  <w:num w:numId="18" w16cid:durableId="1441531950">
-    <w:abstractNumId w:val="11"/>
-  </w:num>
-  <w:num w:numId="19" w16cid:durableId="994840371">
-    <w:abstractNumId w:val="19"/>
-  </w:num>
-  <w:num w:numId="20" w16cid:durableId="1100905818">
-    <w:abstractNumId w:val="12"/>
   </w:num>
 </w:numbering>
 </file>

</xml_diff>